<commit_message>
Update profile name WhatsApp contact and portfolio DOCX
</commit_message>
<xml_diff>
--- a/assets/files/Damar-Margiwiguno-Portfolio.docx
+++ b/assets/files/Damar-Margiwiguno-Portfolio.docx
@@ -17,7 +17,7 @@
           <w:color w:val="1E4E70"/>
           <w:sz w:val="60"/>
         </w:rPr>
-        <w:t>DAMAR MARGIWIGUNO</w:t>
+        <w:t>DAMAR MARGI WIGUNO</w:t>
       </w:r>
     </w:p>
     <w:p>
@@ -1031,7 +1031,7 @@
           <w:color w:val="5C6670"/>
           <w:sz w:val="17"/>
         </w:rPr>
-        <w:t xml:space="preserve">   2024–Present</w:t>
+        <w:t xml:space="preserve">   2024–2026</w:t>
       </w:r>
     </w:p>
     <w:p>

</xml_diff>